<commit_message>
Add public supervisor profile pages and SEO metadata.
Each recognised supervisor gets a public profile page with photo, linked from the supervisors directory. Adds shared SEO helpers and structured data, updates robots and sitemap, and refreshes the workflow docs and presentation.

Co-authored-by: Cursor <cursoragent@cursor.com>
</commit_message>
<xml_diff>
--- a/docs/presentation/Research_ERP_Workflows.docx
+++ b/docs/presentation/Research_ERP_Workflows.docx
@@ -74,7 +74,7 @@
           <w:sz w:val="26"/>
           <w:szCs w:val="26"/>
         </w:rPr>
-        <w:t xml:space="preserve">October 2026</w:t>
+        <w:t xml:space="preserve">October 2026 (revised)</w:t>
       </w:r>
     </w:p>
     <w:p>
@@ -945,7 +945,7 @@
           </w:pPr>
           <w:hyperlink w:history="1" w:anchor="_Toc38">
             <w:r>
-              <w:t xml:space="preserve">11. Notifications</w:t>
+              <w:t xml:space="preserve">11. Public website and search visibility</w:t>
             </w:r>
             <w:r>
               <w:tab/>
@@ -967,7 +967,7 @@
           </w:pPr>
           <w:hyperlink w:history="1" w:anchor="_Toc39">
             <w:r>
-              <w:t xml:space="preserve">12. Data, security and storage</w:t>
+              <w:t xml:space="preserve">12. Notifications</w:t>
             </w:r>
             <w:r>
               <w:tab/>
@@ -989,7 +989,7 @@
           </w:pPr>
           <w:hyperlink w:history="1" w:anchor="_Toc40">
             <w:r>
-              <w:t xml:space="preserve">13. Pending items and way forward</w:t>
+              <w:t xml:space="preserve">13. Data, security and storage</w:t>
             </w:r>
             <w:r>
               <w:tab/>
@@ -997,6 +997,28 @@
             <w:r>
               <w:fldChar w:fldCharType="begin" w:dirty="true"/>
               <w:instrText xml:space="preserve">PAGEREF _Toc40 \h</w:instrText>
+              <w:fldChar w:fldCharType="separate"/>
+              <w:fldChar w:fldCharType="end"/>
+            </w:r>
+          </w:hyperlink>
+        </w:p>
+        <w:p>
+          <w:pPr>
+            <w:pStyle w:val="TOC1"/>
+            <w:tabs>
+              <w:tab w:val="right" w:pos="9638" w:leader="dot"/>
+            </w:tabs>
+          </w:pPr>
+          <w:hyperlink w:history="1" w:anchor="_Toc41">
+            <w:r>
+              <w:t xml:space="preserve">14. Pending items and way forward</w:t>
+            </w:r>
+            <w:r>
+              <w:tab/>
+            </w:r>
+            <w:r>
+              <w:fldChar w:fldCharType="begin" w:dirty="true"/>
+              <w:instrText xml:space="preserve">PAGEREF _Toc41 \h</w:instrText>
               <w:fldChar w:fldCharType="separate"/>
               <w:fldChar w:fldCharType="end"/>
             </w:r>
@@ -1009,7 +1031,7 @@
               <w:tab w:val="right" w:pos="9638" w:leader="dot"/>
             </w:tabs>
           </w:pPr>
-          <w:hyperlink w:history="1" w:anchor="_Toc41">
+          <w:hyperlink w:history="1" w:anchor="_Toc42">
             <w:r>
               <w:t xml:space="preserve">Glossary</w:t>
             </w:r>
@@ -1018,7 +1040,7 @@
             </w:r>
             <w:r>
               <w:fldChar w:fldCharType="begin" w:dirty="true"/>
-              <w:instrText xml:space="preserve">PAGEREF _Toc41 \h</w:instrText>
+              <w:instrText xml:space="preserve">PAGEREF _Toc42 \h</w:instrText>
               <w:fldChar w:fldCharType="separate"/>
               <w:fldChar w:fldCharType="end"/>
             </w:r>
@@ -6733,7 +6755,7 @@
                 <w:sz w:val="20"/>
                 <w:szCs w:val="20"/>
               </w:rPr>
-              <w:t xml:space="preserve">Set-up (research office)</w:t>
+              <w:t xml:space="preserve">Subjects (administrator)</w:t>
             </w:r>
           </w:p>
         </w:tc>
@@ -6766,7 +6788,7 @@
                 <w:sz w:val="20"/>
                 <w:szCs w:val="20"/>
               </w:rPr>
-              <w:t xml:space="preserve">Campuses where scholars may write, each with rooms and seats; timetable (date and time of each paper); maximum marks, pass mark and grades (defaults 100, 50; grades O, A+, A, B+, B, C); instructions printed on the hall ticket</w:t>
+              <w:t xml:space="preserve">Before registration, the administrator adds the subject code and subject title of each paper under Subjects, by semester, school and batch. Semester 1 papers are common to all scholars. Registration for a semester cannot be opened until its subjects are listed, and scholars can register only for listed subjects</w:t>
             </w:r>
           </w:p>
         </w:tc>
@@ -6804,6 +6826,77 @@
                 <w:sz w:val="20"/>
                 <w:szCs w:val="20"/>
               </w:rPr>
+              <w:t xml:space="preserve">Set-up (research office)</w:t>
+            </w:r>
+          </w:p>
+        </w:tc>
+        <w:tc>
+          <w:tcPr>
+            <w:tcW w:type="dxa" w:w="7038"/>
+            <w:tcBorders>
+              <w:top w:val="single" w:color="D9CDD1" w:sz="4"/>
+              <w:left w:val="single" w:color="D9CDD1" w:sz="4"/>
+              <w:bottom w:val="single" w:color="D9CDD1" w:sz="4"/>
+              <w:right w:val="single" w:color="D9CDD1" w:sz="4"/>
+            </w:tcBorders>
+            <w:tcMar>
+              <w:top w:type="dxa" w:w="70"/>
+              <w:left w:type="dxa" w:w="110"/>
+              <w:bottom w:type="dxa" w:w="70"/>
+              <w:right w:type="dxa" w:w="110"/>
+            </w:tcMar>
+          </w:tcPr>
+          <w:p>
+            <w:pPr>
+              <w:spacing w:after="0"/>
+            </w:pPr>
+            <w:r>
+              <w:rPr>
+                <w:rFonts w:ascii="Calibri" w:cs="Calibri" w:eastAsia="Calibri" w:hAnsi="Calibri"/>
+                <w:b w:val="false"/>
+                <w:bCs w:val="false"/>
+                <w:color w:val="2A2A33"/>
+                <w:sz w:val="20"/>
+                <w:szCs w:val="20"/>
+              </w:rPr>
+              <w:t xml:space="preserve">Campuses where scholars may write, each with rooms and seats; timetable (date and time of each paper); maximum marks, pass mark and grades (defaults 100, 50; grades O, A+, A, B+, B, C); instructions printed on the hall ticket</w:t>
+            </w:r>
+          </w:p>
+        </w:tc>
+      </w:tr>
+      <w:tr>
+        <w:trPr>
+          <w:cantSplit/>
+        </w:trPr>
+        <w:tc>
+          <w:tcPr>
+            <w:tcW w:type="dxa" w:w="2600"/>
+            <w:tcBorders>
+              <w:top w:val="single" w:color="D9CDD1" w:sz="4"/>
+              <w:left w:val="single" w:color="D9CDD1" w:sz="4"/>
+              <w:bottom w:val="single" w:color="D9CDD1" w:sz="4"/>
+              <w:right w:val="single" w:color="D9CDD1" w:sz="4"/>
+            </w:tcBorders>
+            <w:tcMar>
+              <w:top w:type="dxa" w:w="70"/>
+              <w:left w:type="dxa" w:w="110"/>
+              <w:bottom w:type="dxa" w:w="70"/>
+              <w:right w:type="dxa" w:w="110"/>
+            </w:tcMar>
+          </w:tcPr>
+          <w:p>
+            <w:pPr>
+              <w:spacing w:after="0"/>
+            </w:pPr>
+            <w:r>
+              <w:rPr>
+                <w:rFonts w:ascii="Calibri" w:cs="Calibri" w:eastAsia="Calibri" w:hAnsi="Calibri"/>
+                <w:b w:val="false"/>
+                <w:bCs w:val="false"/>
+                <w:color w:val="2A2A33"/>
+                <w:sz w:val="20"/>
+                <w:szCs w:val="20"/>
+              </w:rPr>
               <w:t xml:space="preserve">Registration</w:t>
             </w:r>
           </w:p>
@@ -6837,7 +6930,7 @@
                 <w:sz w:val="20"/>
                 <w:szCs w:val="20"/>
               </w:rPr>
-              <w:t xml:space="preserve">The scholar chooses the campus and uploads the fee receipt; Accounts approves or returns it</w:t>
+              <w:t xml:space="preserve">The administrator opens the registration window for the batch with a last date. The scholar picks from the listed subjects (two new papers a semester, plus any arrears), chooses the campus and uploads the fee receipt; Accounts approves or returns it</w:t>
             </w:r>
           </w:p>
         </w:tc>
@@ -7723,9 +7816,163 @@
           <w:sz w:val="34"/>
           <w:szCs w:val="34"/>
         </w:rPr>
-        <w:t xml:space="preserve">11. Notifications</w:t>
+        <w:t xml:space="preserve">11. Public website and search visibility</w:t>
       </w:r>
       <w:bookmarkEnd w:id="38"/>
+    </w:p>
+    <w:p>
+      <w:pPr>
+        <w:spacing w:after="120" w:line="276"/>
+      </w:pPr>
+      <w:r>
+        <w:rPr>
+          <w:rFonts w:ascii="Calibri" w:cs="Calibri" w:eastAsia="Calibri" w:hAnsi="Calibri"/>
+          <w:color w:val="2A2A33"/>
+          <w:sz w:val="22"/>
+          <w:szCs w:val="22"/>
+        </w:rPr>
+        <w:t xml:space="preserve">The public website is built so that candidates and supervisors can find the programme through search engines.</w:t>
+      </w:r>
+    </w:p>
+    <w:p>
+      <w:pPr>
+        <w:pStyle w:val="ListParagraph"/>
+        <w:numPr>
+          <w:ilvl w:val="0"/>
+          <w:numId w:val="2"/>
+        </w:numPr>
+        <w:spacing w:after="60" w:line="264"/>
+      </w:pPr>
+      <w:r>
+        <w:rPr>
+          <w:rFonts w:ascii="Calibri" w:cs="Calibri" w:eastAsia="Calibri" w:hAnsi="Calibri"/>
+          <w:b/>
+          <w:bCs/>
+          <w:color w:val="2A2A33"/>
+          <w:sz w:val="22"/>
+          <w:szCs w:val="22"/>
+        </w:rPr>
+        <w:t xml:space="preserve">Supervisors page. </w:t>
+      </w:r>
+      <w:r>
+        <w:rPr>
+          <w:rFonts w:ascii="Calibri" w:cs="Calibri" w:eastAsia="Calibri" w:hAnsi="Calibri"/>
+          <w:color w:val="2A2A33"/>
+          <w:sz w:val="22"/>
+          <w:szCs w:val="22"/>
+        </w:rPr>
+        <w:t xml:space="preserve">Generated on the server from the published profiles, so search engines read every name, area of research and biography. Each supervisor also has a page of their own with a title, description and social-sharing tags, and the profile photographs have descriptive text. The page is refreshed within minutes of a change by the research office.</w:t>
+      </w:r>
+    </w:p>
+    <w:p>
+      <w:pPr>
+        <w:pStyle w:val="ListParagraph"/>
+        <w:numPr>
+          <w:ilvl w:val="0"/>
+          <w:numId w:val="2"/>
+        </w:numPr>
+        <w:spacing w:after="60" w:line="264"/>
+      </w:pPr>
+      <w:r>
+        <w:rPr>
+          <w:rFonts w:ascii="Calibri" w:cs="Calibri" w:eastAsia="Calibri" w:hAnsi="Calibri"/>
+          <w:b/>
+          <w:bCs/>
+          <w:color w:val="2A2A33"/>
+          <w:sz w:val="22"/>
+          <w:szCs w:val="22"/>
+        </w:rPr>
+        <w:t xml:space="preserve">Structured data. </w:t>
+      </w:r>
+      <w:r>
+        <w:rPr>
+          <w:rFonts w:ascii="Calibri" w:cs="Calibri" w:eastAsia="Calibri" w:hAnsi="Calibri"/>
+          <w:color w:val="2A2A33"/>
+          <w:sz w:val="22"/>
+          <w:szCs w:val="22"/>
+        </w:rPr>
+        <w:t xml:space="preserve">The university and website are described on every page; supervisors are described as people with designation, department, areas of research and Vidwan link, and each page carries breadcrumbs.</w:t>
+      </w:r>
+    </w:p>
+    <w:p>
+      <w:pPr>
+        <w:pStyle w:val="ListParagraph"/>
+        <w:numPr>
+          <w:ilvl w:val="0"/>
+          <w:numId w:val="2"/>
+        </w:numPr>
+        <w:spacing w:after="60" w:line="264"/>
+      </w:pPr>
+      <w:r>
+        <w:rPr>
+          <w:rFonts w:ascii="Calibri" w:cs="Calibri" w:eastAsia="Calibri" w:hAnsi="Calibri"/>
+          <w:b/>
+          <w:bCs/>
+          <w:color w:val="2A2A33"/>
+          <w:sz w:val="22"/>
+          <w:szCs w:val="22"/>
+        </w:rPr>
+        <w:t xml:space="preserve">Sitemap and robots. </w:t>
+      </w:r>
+      <w:r>
+        <w:rPr>
+          <w:rFonts w:ascii="Calibri" w:cs="Calibri" w:eastAsia="Calibri" w:hAnsi="Calibri"/>
+          <w:color w:val="2A2A33"/>
+          <w:sz w:val="22"/>
+          <w:szCs w:val="22"/>
+        </w:rPr>
+        <w:t xml:space="preserve">The sitemap lists the public pages and every published supervisor. Portals, sign-in pages and the programming interface are kept out of search results.</w:t>
+      </w:r>
+    </w:p>
+    <w:p>
+      <w:pPr>
+        <w:pStyle w:val="ListParagraph"/>
+        <w:numPr>
+          <w:ilvl w:val="0"/>
+          <w:numId w:val="2"/>
+        </w:numPr>
+        <w:spacing w:after="60" w:line="264"/>
+      </w:pPr>
+      <w:r>
+        <w:rPr>
+          <w:rFonts w:ascii="Calibri" w:cs="Calibri" w:eastAsia="Calibri" w:hAnsi="Calibri"/>
+          <w:b/>
+          <w:bCs/>
+          <w:color w:val="2A2A33"/>
+          <w:sz w:val="22"/>
+          <w:szCs w:val="22"/>
+        </w:rPr>
+        <w:t xml:space="preserve">Privacy. </w:t>
+      </w:r>
+      <w:r>
+        <w:rPr>
+          <w:rFonts w:ascii="Calibri" w:cs="Calibri" w:eastAsia="Calibri" w:hAnsi="Calibri"/>
+          <w:color w:val="2A2A33"/>
+          <w:sz w:val="22"/>
+          <w:szCs w:val="22"/>
+        </w:rPr>
+        <w:t xml:space="preserve">Only the public profile fields are published; a supervisor's sign-in e-mail is never shown.</w:t>
+      </w:r>
+    </w:p>
+    <w:p>
+      <w:pPr>
+        <w:pStyle w:val="Heading1"/>
+        <w:pageBreakBefore/>
+        <w:spacing w:after="200" w:before="0"/>
+      </w:pPr>
+      <w:bookmarkStart w:name="_Toc39" w:id="39"/>
+      <w:r>
+        <w:rPr>
+          <w:rFonts w:ascii="Cambria" w:cs="Cambria" w:eastAsia="Cambria" w:hAnsi="Cambria"/>
+          <w:b/>
+          <w:bCs/>
+          <w:color w:val="6B1E2E"/>
+          <w:sz w:val="34"/>
+          <w:szCs w:val="34"/>
+        </w:rPr>
+        <w:t xml:space="preserve">12. Notifications</w:t>
+      </w:r>
+      <w:bookmarkEnd w:id="39"/>
     </w:p>
     <w:tbl>
       <w:tblPr>
@@ -8268,7 +8515,7 @@
         <w:pageBreakBefore/>
         <w:spacing w:after="200" w:before="0"/>
       </w:pPr>
-      <w:bookmarkStart w:name="_Toc39" w:id="39"/>
+      <w:bookmarkStart w:name="_Toc40" w:id="40"/>
       <w:r>
         <w:rPr>
           <w:rFonts w:ascii="Cambria" w:cs="Cambria" w:eastAsia="Cambria" w:hAnsi="Cambria"/>
@@ -8278,9 +8525,9 @@
           <w:sz w:val="34"/>
           <w:szCs w:val="34"/>
         </w:rPr>
-        <w:t xml:space="preserve">12. Data, security and storage</w:t>
-      </w:r>
-      <w:bookmarkEnd w:id="39"/>
+        <w:t xml:space="preserve">13. Data, security and storage</w:t>
+      </w:r>
+      <w:bookmarkEnd w:id="40"/>
     </w:p>
     <w:p>
       <w:pPr>
@@ -8468,7 +8715,7 @@
         <w:pageBreakBefore/>
         <w:spacing w:after="200" w:before="0"/>
       </w:pPr>
-      <w:bookmarkStart w:name="_Toc40" w:id="40"/>
+      <w:bookmarkStart w:name="_Toc41" w:id="41"/>
       <w:r>
         <w:rPr>
           <w:rFonts w:ascii="Cambria" w:cs="Cambria" w:eastAsia="Cambria" w:hAnsi="Cambria"/>
@@ -8478,9 +8725,9 @@
           <w:sz w:val="34"/>
           <w:szCs w:val="34"/>
         </w:rPr>
-        <w:t xml:space="preserve">13. Pending items and way forward</w:t>
-      </w:r>
-      <w:bookmarkEnd w:id="40"/>
+        <w:t xml:space="preserve">14. Pending items and way forward</w:t>
+      </w:r>
+      <w:bookmarkEnd w:id="41"/>
     </w:p>
     <w:p>
       <w:pPr>
@@ -8563,7 +8810,7 @@
         <w:pStyle w:val="Heading2"/>
         <w:spacing w:after="100" w:before="240"/>
       </w:pPr>
-      <w:bookmarkStart w:name="_Toc41" w:id="41"/>
+      <w:bookmarkStart w:name="_Toc42" w:id="42"/>
       <w:r>
         <w:rPr>
           <w:rFonts w:ascii="Cambria" w:cs="Cambria" w:eastAsia="Cambria" w:hAnsi="Cambria"/>
@@ -8575,7 +8822,7 @@
         </w:rPr>
         <w:t xml:space="preserve">Glossary</w:t>
       </w:r>
-      <w:bookmarkEnd w:id="41"/>
+      <w:bookmarkEnd w:id="42"/>
     </w:p>
     <w:tbl>
       <w:tblPr>

</xml_diff>